<commit_message>
Address supervisor review comments and fix paper figure layout
- Rename the layer as a supervised meta-classifier followed by conformal calibration (abstract, methods, contributions)
- Table 3: one consistent 5-split protocol, mean +/- SD, add an abstain/RETAKE rate column
- Rename Section 4.4 to "Exploratory image-level triage on TONO"
- Add correct-target vs wrong-reason REJECT decomposition (822 / 67 / 36 / 0 on 925 violation images)
- Phrase the Mondrian result as restoring the intended label-conditional coverage; report CIs and calibration counts
- Remove manual page breaks so figures no longer sit alone (paper 10 -> 8 pages)
</commit_message>
<xml_diff>
--- a/results_v3/Paper1_v3_draft.docx
+++ b/results_v3/Paper1_v3_draft.docx
@@ -93,7 +93,7 @@
         <w:jc w:val="both"/>
       </w:pPr>
       <w:r>
-        <w:t xml:space="preserve">Automated verification of ICAO/ISO compliance for face images in machine-readable travel documents is typically performed by rule-based analyzers that return hard pass/fail decisions per requirement. Such decisions carry no statistical guarantee, and their false rejections translate into unnecessary photo retakes, while a missed violation is far more costly, so the operational problem is triage under class imbalance and asymmetric error cost. We wrap an existing rule-based analyzer (BioGaze) with a lightweight per-criterion calibration layer and study, on the TONO synthetic ICAO benchmark under a strictly subject-disjoint protocol, what distribution-free guarantees a multi-criterion compliance pipeline can and cannot deliver. Our study is empirical and diagnostic rather than a new estimator. We report four findings. First, marginal split-conformal holds its overall coverage target (0.90) but silently under-covers the minority violation class on 6 of the 14 criteria (as low as 0.37 with a 95% confidence interval of 0.33 to 0.41), and label-conditional (Mondrian) conformal restores per-class coverage to about 0.90 with confidence intervals disjoint from the marginal method on exactly those criteria. Second, through a feature ablation we show the coverage guarantee is feature-agnostic, as theory predicts, whereas most of the apparent false-flag reduction is an artifact of the single-violation dataset structure and is not, by itself, evidence for conformal prediction. Third, across six triage strategies the honest picture is a false-flag versus detection trade-off in which recalibration supplies the accuracy and conformal supplies the guarantee, and a correctly randomized adaptive prediction set (APS) is competitive rather than degenerate. Fourth, a 14-criterion image-level decision incurs a multiple-comparison problem: naive joint coverage collapses to about 0.27, and a Bonferroni-corrected image-level guarantee of about 0.91 is attainable only by routing almost every image to retake. We confine claims to what TONO can support: it is single-violation, so the ACCEPT class is empty and cannot be validated, which motivates real multi-attribute data as follow-up.</w:t>
+        <w:t xml:space="preserve">Automated verification of ICAO/ISO compliance for face images in machine-readable travel documents is typically performed by rule-based analyzers that return hard pass/fail decisions per requirement. Such decisions carry no statistical guarantee, and their false rejections translate into unnecessary photo retakes, while a missed violation is far more costly, so the operational problem is triage under class imbalance and asymmetric error cost. We wrap an existing rule-based analyzer (BioGaze) with a lightweight per-criterion supervised meta-classifier followed by conformal calibration, and study, on the TONO synthetic ICAO benchmark under a strictly subject-disjoint protocol, what distribution-free guarantees a multi-criterion compliance pipeline can and cannot deliver. Our study is empirical and diagnostic rather than a new estimator. We report four findings. First, marginal split-conformal holds its overall coverage target (0.90) but silently under-covers the minority violation class on 6 of the 14 criteria (as low as 0.37 with a 95% confidence interval of 0.33 to 0.41), and label-conditional (Mondrian) conformal restores per-class coverage to about 0.90 with confidence intervals disjoint from the marginal method on exactly those criteria. Second, through a feature ablation we show the coverage guarantee is feature-agnostic, as theory predicts, whereas most of the apparent false-flag reduction is an artifact of the single-violation dataset structure and is not, by itself, evidence for conformal prediction. Third, across six triage strategies the honest picture is a false-flag versus detection trade-off in which recalibration supplies the accuracy and conformal supplies the guarantee, and a correctly randomized adaptive prediction set (APS) is competitive rather than degenerate. Fourth, a 14-criterion image-level decision incurs a multiple-comparison problem: naive joint coverage collapses to about 0.27, and a Bonferroni-corrected image-level guarantee of about 0.91 is attainable only by routing almost every image to retake. We confine claims to what TONO can support: it is single-violation, so the ACCEPT class is empty and cannot be validated, which motivates real multi-attribute data as follow-up.</w:t>
       </w:r>
     </w:p>
     <w:p>
@@ -146,7 +146,7 @@
         <w:jc w:val="both"/>
       </w:pPr>
       <w:r>
-        <w:t xml:space="preserve">A model-agnostic per-criterion calibration layer that endows each of 14 ICAO decisions of a rule-based analyzer with a distribution-free coverage guarantee, evaluated under a subject-disjoint protocol with confidence intervals over ten splits.</w:t>
+        <w:t xml:space="preserve">A model-agnostic per-criterion supervised meta-classifier with conformal calibration that endows each of 14 ICAO decisions of a rule-based analyzer with a distribution-free coverage guarantee, evaluated under a subject-disjoint protocol with confidence intervals over ten splits.</w:t>
       </w:r>
     </w:p>
     <w:p>
@@ -188,7 +188,7 @@
         <w:jc w:val="both"/>
       </w:pPr>
       <w:r>
-        <w:t xml:space="preserve">A characterisation of the multiple-comparison problem intrinsic to a 14-criterion image-level decision, including a Bonferroni-corrected joint guarantee and its conservatism cost, together with an explicit statement of what TONO cannot evaluate.</w:t>
+        <w:t xml:space="preserve">An image-level triage analysis that decomposes rejections into correct-target versus wrong-reason, a characterisation of the multiple-comparison problem intrinsic to a 14-criterion decision (a Bonferroni-corrected joint guarantee and its conservatism cost), and an explicit statement of what TONO cannot evaluate.</w:t>
       </w:r>
     </w:p>
     <w:p>
@@ -308,7 +308,7 @@
         <w:spacing w:after="80" w:before="170"/>
       </w:pPr>
       <w:r>
-        <w:t xml:space="preserve">3.1 Features and per-criterion classifier</w:t>
+        <w:t xml:space="preserve">3.1 Features and per-criterion meta-classifier</w:t>
       </w:r>
     </w:p>
     <w:p>
@@ -317,7 +317,7 @@
         <w:jc w:val="both"/>
       </w:pPr>
       <w:r>
-        <w:t xml:space="preserve">For each image, BioGaze produces 14 binary ICAO decisions together with continuous metrics (inter-eye distance, head-pose angles, eye and mouth openness, and a glasses indicator). For each criterion we fit a class-balanced logistic regression to predict the ground-truth label, violation versus compliant, from these outputs. The analyzer is never retrained; the layer only calibrates its outputs. Section 4.1 examines, by ablation, which features actually drive the result.</w:t>
+        <w:t xml:space="preserve">For each image, BioGaze produces 14 binary ICAO decisions together with continuous metrics (inter-eye distance, head-pose angles, eye and mouth openness, and a glasses indicator). For each criterion we fit a class-balanced logistic regression to predict the ground-truth label, violation versus compliant, from these outputs. This is a supervised meta-classifier over all BioGaze-derived features, not a probability calibration of a single criterion's own decision, followed by conformal calibration of its scores; the analyzer itself is never retrained. Section 4.1 examines, by ablation, which features actually drive the result, since using all 14 decisions lets the classifier exploit cross-criterion structure specific to the single-violation dataset.</w:t>
       </w:r>
     </w:p>
     <w:p>
@@ -1022,7 +1022,7 @@
         <w:jc w:val="both"/>
       </w:pPr>
       <w:r>
-        <w:t xml:space="preserve">With the exact quantile and zoom images excluded (Section 3), marginal LAC holds its overall target (about 0.90) but under-covers the violation class on 6 of the 14 criteria (5 excluding the small-sample Frontal pose): No posterization 0.37 (95% interval 0.33 to 0.41), No sunglasses 0.68 (0.63 to 0.72), In focus 0.73 (0.69 to 0.76), Head without covering 0.80 (0.76 to 0.83), and No pixelation 0.81 (0.77 to 0.84). Mondrian raises each of these to about 0.89 to 0.92 with confidence intervals disjoint from the marginal method, and does no measurable harm on the criteria where marginal coverage was already adequate (Figure 3, Table 2). Excluding one degenerate small-sample criterion (Frontal pose, about 11 calibration positives), the pooled Mondrian violation coverage over the 13 stable criteria is 0.90. This is the central result: under class imbalance the guarantee that matters is class-conditional, and marginal conformal does not provide it.</w:t>
+        <w:t xml:space="preserve">With the exact quantile and zoom images excluded (Section 3), marginal LAC holds its overall target (about 0.90) but under-covers the violation class on 6 of the 14 criteria (5 excluding the small-sample Frontal pose): No posterization 0.37 (95% interval 0.33 to 0.41), No sunglasses 0.68 (0.63 to 0.72), In focus 0.73 (0.69 to 0.76), Head without covering 0.80 (0.76 to 0.83), and No pixelation 0.81 (0.77 to 0.84). Mondrian raises each of these to about 0.89 to 0.92 with confidence intervals disjoint from the marginal method, and does no measurable harm on the criteria where marginal coverage was already adequate (Figure 3, Table 2). Excluding one degenerate small-sample criterion (Frontal pose, about 11 calibration positives), the pooled Mondrian violation coverage over the 13 stable criteria is 0.90. We interpret this as restoring the intended label-conditional coverage property, that is, bringing mean violation coverage to the target, and not as a claim that every criterion exceeds 0.90 on every split (several Mondrian point estimates sit just below 0.90, which is why we report intervals and calibration counts). This is the central result: under class imbalance the guarantee that matters is class-conditional, and marginal conformal does not provide it.</w:t>
       </w:r>
     </w:p>
     <w:p>
@@ -3049,12 +3049,12 @@
         <w:t xml:space="preserve">Table 3. </w:t>
       </w:r>
       <w:r>
-        <w:t xml:space="preserve">Six triage strategies on the common subject-disjoint test set (five seeds), false-positive rate and recall on true violations.</w:t>
+        <w:t xml:space="preserve">Six triage strategies on one consistent protocol (mean plus or minus SD over the same five subject-disjoint splits). FPR and recall are per-criterion; the abstain/RETAKE rate is the fraction of per-criterion decisions that are not confident singletons.</w:t>
       </w:r>
     </w:p>
     <w:tbl>
       <w:tblPr>
-        <w:tblW w:type="dxa" w:w="9300"/>
+        <w:tblW w:type="dxa" w:w="9400"/>
         <w:tblBorders>
           <w:top w:val="single" w:color="auto" w:sz="4"/>
           <w:left w:val="single" w:color="auto" w:sz="4"/>
@@ -3065,10 +3065,11 @@
         </w:tblBorders>
       </w:tblPr>
       <w:tblGrid>
-        <w:gridCol w:w="3800"/>
+        <w:gridCol w:w="2900"/>
+        <w:gridCol w:w="1900"/>
+        <w:gridCol w:w="1900"/>
         <w:gridCol w:w="1700"/>
-        <w:gridCol w:w="2400"/>
-        <w:gridCol w:w="1400"/>
+        <w:gridCol w:w="1000"/>
       </w:tblGrid>
       <w:tr>
         <w:trPr>
@@ -3076,7 +3077,7 @@
         </w:trPr>
         <w:tc>
           <w:tcPr>
-            <w:tcW w:type="dxa" w:w="3800"/>
+            <w:tcW w:type="dxa" w:w="2900"/>
             <w:shd w:fill="0f9d8f"/>
           </w:tcPr>
           <w:p>
@@ -3097,7 +3098,7 @@
         </w:tc>
         <w:tc>
           <w:tcPr>
-            <w:tcW w:type="dxa" w:w="1700"/>
+            <w:tcW w:type="dxa" w:w="1900"/>
             <w:shd w:fill="0f9d8f"/>
           </w:tcPr>
           <w:p>
@@ -3118,7 +3119,7 @@
         </w:tc>
         <w:tc>
           <w:tcPr>
-            <w:tcW w:type="dxa" w:w="2400"/>
+            <w:tcW w:type="dxa" w:w="1900"/>
             <w:shd w:fill="0f9d8f"/>
           </w:tcPr>
           <w:p>
@@ -3139,7 +3140,7 @@
         </w:tc>
         <w:tc>
           <w:tcPr>
-            <w:tcW w:type="dxa" w:w="1400"/>
+            <w:tcW w:type="dxa" w:w="1700"/>
             <w:shd w:fill="0f9d8f"/>
           </w:tcPr>
           <w:p>
@@ -3154,6 +3155,27 @@
                 <w:sz w:val="16"/>
                 <w:szCs w:val="16"/>
               </w:rPr>
+              <w:t xml:space="preserve">Abstain / RETAKE</w:t>
+            </w:r>
+          </w:p>
+        </w:tc>
+        <w:tc>
+          <w:tcPr>
+            <w:tcW w:type="dxa" w:w="1000"/>
+            <w:shd w:fill="0f9d8f"/>
+          </w:tcPr>
+          <w:p>
+            <w:pPr>
+              <w:jc w:val="center"/>
+            </w:pPr>
+            <w:r>
+              <w:rPr>
+                <w:b/>
+                <w:bCs/>
+                <w:color w:val="ffffff"/>
+                <w:sz w:val="16"/>
+                <w:szCs w:val="16"/>
+              </w:rPr>
               <w:t xml:space="preserve">Output</w:t>
             </w:r>
           </w:p>
@@ -3162,7 +3184,7 @@
       <w:tr>
         <w:tc>
           <w:tcPr>
-            <w:tcW w:type="dxa" w:w="3800"/>
+            <w:tcW w:type="dxa" w:w="2900"/>
           </w:tcPr>
           <w:p>
             <w:pPr>
@@ -3182,6 +3204,46 @@
         </w:tc>
         <w:tc>
           <w:tcPr>
+            <w:tcW w:type="dxa" w:w="1900"/>
+          </w:tcPr>
+          <w:p>
+            <w:pPr>
+              <w:jc w:val="center"/>
+            </w:pPr>
+            <w:r>
+              <w:rPr>
+                <w:b w:val="false"/>
+                <w:bCs w:val="false"/>
+                <w:color w:val="1f2933"/>
+                <w:sz w:val="16"/>
+                <w:szCs w:val="16"/>
+              </w:rPr>
+              <w:t xml:space="preserve">0.144 ± 0.005</w:t>
+            </w:r>
+          </w:p>
+        </w:tc>
+        <w:tc>
+          <w:tcPr>
+            <w:tcW w:type="dxa" w:w="1900"/>
+          </w:tcPr>
+          <w:p>
+            <w:pPr>
+              <w:jc w:val="center"/>
+            </w:pPr>
+            <w:r>
+              <w:rPr>
+                <w:b w:val="false"/>
+                <w:bCs w:val="false"/>
+                <w:color w:val="1f2933"/>
+                <w:sz w:val="16"/>
+                <w:szCs w:val="16"/>
+              </w:rPr>
+              <w:t xml:space="preserve">0.955 ± 0.003</w:t>
+            </w:r>
+          </w:p>
+        </w:tc>
+        <w:tc>
+          <w:tcPr>
             <w:tcW w:type="dxa" w:w="1700"/>
           </w:tcPr>
           <w:p>
@@ -3196,33 +3258,13 @@
                 <w:sz w:val="16"/>
                 <w:szCs w:val="16"/>
               </w:rPr>
-              <w:t xml:space="preserve">0.144</w:t>
-            </w:r>
-          </w:p>
-        </w:tc>
-        <w:tc>
-          <w:tcPr>
-            <w:tcW w:type="dxa" w:w="2400"/>
-          </w:tcPr>
-          <w:p>
-            <w:pPr>
-              <w:jc w:val="center"/>
-            </w:pPr>
-            <w:r>
-              <w:rPr>
-                <w:b w:val="false"/>
-                <w:bCs w:val="false"/>
-                <w:color w:val="1f2933"/>
-                <w:sz w:val="16"/>
-                <w:szCs w:val="16"/>
-              </w:rPr>
-              <w:t xml:space="preserve">0.955</w:t>
-            </w:r>
-          </w:p>
-        </w:tc>
-        <w:tc>
-          <w:tcPr>
-            <w:tcW w:type="dxa" w:w="1400"/>
+              <w:t xml:space="preserve">0.00</w:t>
+            </w:r>
+          </w:p>
+        </w:tc>
+        <w:tc>
+          <w:tcPr>
+            <w:tcW w:type="dxa" w:w="1000"/>
           </w:tcPr>
           <w:p>
             <w:pPr>
@@ -3244,7 +3286,7 @@
       <w:tr>
         <w:tc>
           <w:tcPr>
-            <w:tcW w:type="dxa" w:w="3800"/>
+            <w:tcW w:type="dxa" w:w="2900"/>
             <w:shd w:fill="eef4f3"/>
           </w:tcPr>
           <w:p>
@@ -3265,6 +3307,48 @@
         </w:tc>
         <w:tc>
           <w:tcPr>
+            <w:tcW w:type="dxa" w:w="1900"/>
+            <w:shd w:fill="eef4f3"/>
+          </w:tcPr>
+          <w:p>
+            <w:pPr>
+              <w:jc w:val="center"/>
+            </w:pPr>
+            <w:r>
+              <w:rPr>
+                <w:b w:val="false"/>
+                <w:bCs w:val="false"/>
+                <w:color w:val="1f2933"/>
+                <w:sz w:val="16"/>
+                <w:szCs w:val="16"/>
+              </w:rPr>
+              <w:t xml:space="preserve">0.048 ± 0.004</w:t>
+            </w:r>
+          </w:p>
+        </w:tc>
+        <w:tc>
+          <w:tcPr>
+            <w:tcW w:type="dxa" w:w="1900"/>
+            <w:shd w:fill="eef4f3"/>
+          </w:tcPr>
+          <w:p>
+            <w:pPr>
+              <w:jc w:val="center"/>
+            </w:pPr>
+            <w:r>
+              <w:rPr>
+                <w:b w:val="false"/>
+                <w:bCs w:val="false"/>
+                <w:color w:val="1f2933"/>
+                <w:sz w:val="16"/>
+                <w:szCs w:val="16"/>
+              </w:rPr>
+              <w:t xml:space="preserve">0.939 ± 0.012</w:t>
+            </w:r>
+          </w:p>
+        </w:tc>
+        <w:tc>
+          <w:tcPr>
             <w:tcW w:type="dxa" w:w="1700"/>
             <w:shd w:fill="eef4f3"/>
           </w:tcPr>
@@ -3280,34 +3364,13 @@
                 <w:sz w:val="16"/>
                 <w:szCs w:val="16"/>
               </w:rPr>
-              <w:t xml:space="preserve">0.048</w:t>
-            </w:r>
-          </w:p>
-        </w:tc>
-        <w:tc>
-          <w:tcPr>
-            <w:tcW w:type="dxa" w:w="2400"/>
-            <w:shd w:fill="eef4f3"/>
-          </w:tcPr>
-          <w:p>
-            <w:pPr>
-              <w:jc w:val="center"/>
-            </w:pPr>
-            <w:r>
-              <w:rPr>
-                <w:b w:val="false"/>
-                <w:bCs w:val="false"/>
-                <w:color w:val="1f2933"/>
-                <w:sz w:val="16"/>
-                <w:szCs w:val="16"/>
-              </w:rPr>
-              <w:t xml:space="preserve">0.939</w:t>
-            </w:r>
-          </w:p>
-        </w:tc>
-        <w:tc>
-          <w:tcPr>
-            <w:tcW w:type="dxa" w:w="1400"/>
+              <w:t xml:space="preserve">0.00</w:t>
+            </w:r>
+          </w:p>
+        </w:tc>
+        <w:tc>
+          <w:tcPr>
+            <w:tcW w:type="dxa" w:w="1000"/>
             <w:shd w:fill="eef4f3"/>
           </w:tcPr>
           <w:p>
@@ -3330,7 +3393,7 @@
       <w:tr>
         <w:tc>
           <w:tcPr>
-            <w:tcW w:type="dxa" w:w="3800"/>
+            <w:tcW w:type="dxa" w:w="2900"/>
           </w:tcPr>
           <w:p>
             <w:pPr>
@@ -3350,6 +3413,46 @@
         </w:tc>
         <w:tc>
           <w:tcPr>
+            <w:tcW w:type="dxa" w:w="1900"/>
+          </w:tcPr>
+          <w:p>
+            <w:pPr>
+              <w:jc w:val="center"/>
+            </w:pPr>
+            <w:r>
+              <w:rPr>
+                <w:b w:val="false"/>
+                <w:bCs w:val="false"/>
+                <w:color w:val="1f2933"/>
+                <w:sz w:val="16"/>
+                <w:szCs w:val="16"/>
+              </w:rPr>
+              <w:t xml:space="preserve">0.036 ± 0.004</w:t>
+            </w:r>
+          </w:p>
+        </w:tc>
+        <w:tc>
+          <w:tcPr>
+            <w:tcW w:type="dxa" w:w="1900"/>
+          </w:tcPr>
+          <w:p>
+            <w:pPr>
+              <w:jc w:val="center"/>
+            </w:pPr>
+            <w:r>
+              <w:rPr>
+                <w:b w:val="false"/>
+                <w:bCs w:val="false"/>
+                <w:color w:val="1f2933"/>
+                <w:sz w:val="16"/>
+                <w:szCs w:val="16"/>
+              </w:rPr>
+              <w:t xml:space="preserve">0.920 ± 0.016</w:t>
+            </w:r>
+          </w:p>
+        </w:tc>
+        <w:tc>
+          <w:tcPr>
             <w:tcW w:type="dxa" w:w="1700"/>
           </w:tcPr>
           <w:p>
@@ -3364,33 +3467,13 @@
                 <w:sz w:val="16"/>
                 <w:szCs w:val="16"/>
               </w:rPr>
-              <w:t xml:space="preserve">0.036</w:t>
-            </w:r>
-          </w:p>
-        </w:tc>
-        <w:tc>
-          <w:tcPr>
-            <w:tcW w:type="dxa" w:w="2400"/>
-          </w:tcPr>
-          <w:p>
-            <w:pPr>
-              <w:jc w:val="center"/>
-            </w:pPr>
-            <w:r>
-              <w:rPr>
-                <w:b w:val="false"/>
-                <w:bCs w:val="false"/>
-                <w:color w:val="1f2933"/>
-                <w:sz w:val="16"/>
-                <w:szCs w:val="16"/>
-              </w:rPr>
-              <w:t xml:space="preserve">0.920</w:t>
-            </w:r>
-          </w:p>
-        </w:tc>
-        <w:tc>
-          <w:tcPr>
-            <w:tcW w:type="dxa" w:w="1400"/>
+              <w:t xml:space="preserve">0.03</w:t>
+            </w:r>
+          </w:p>
+        </w:tc>
+        <w:tc>
+          <w:tcPr>
+            <w:tcW w:type="dxa" w:w="1000"/>
           </w:tcPr>
           <w:p>
             <w:pPr>
@@ -3412,7 +3495,7 @@
       <w:tr>
         <w:tc>
           <w:tcPr>
-            <w:tcW w:type="dxa" w:w="3800"/>
+            <w:tcW w:type="dxa" w:w="2900"/>
             <w:shd w:fill="eef4f3"/>
           </w:tcPr>
           <w:p>
@@ -3433,6 +3516,48 @@
         </w:tc>
         <w:tc>
           <w:tcPr>
+            <w:tcW w:type="dxa" w:w="1900"/>
+            <w:shd w:fill="eef4f3"/>
+          </w:tcPr>
+          <w:p>
+            <w:pPr>
+              <w:jc w:val="center"/>
+            </w:pPr>
+            <w:r>
+              <w:rPr>
+                <w:b w:val="false"/>
+                <w:bCs w:val="false"/>
+                <w:color w:val="1f2933"/>
+                <w:sz w:val="16"/>
+                <w:szCs w:val="16"/>
+              </w:rPr>
+              <w:t xml:space="preserve">0.036 ± 0.004</w:t>
+            </w:r>
+          </w:p>
+        </w:tc>
+        <w:tc>
+          <w:tcPr>
+            <w:tcW w:type="dxa" w:w="1900"/>
+            <w:shd w:fill="eef4f3"/>
+          </w:tcPr>
+          <w:p>
+            <w:pPr>
+              <w:jc w:val="center"/>
+            </w:pPr>
+            <w:r>
+              <w:rPr>
+                <w:b w:val="false"/>
+                <w:bCs w:val="false"/>
+                <w:color w:val="1f2933"/>
+                <w:sz w:val="16"/>
+                <w:szCs w:val="16"/>
+              </w:rPr>
+              <w:t xml:space="preserve">0.807 ± 0.016</w:t>
+            </w:r>
+          </w:p>
+        </w:tc>
+        <w:tc>
+          <w:tcPr>
             <w:tcW w:type="dxa" w:w="1700"/>
             <w:shd w:fill="eef4f3"/>
           </w:tcPr>
@@ -3448,34 +3573,13 @@
                 <w:sz w:val="16"/>
                 <w:szCs w:val="16"/>
               </w:rPr>
-              <w:t xml:space="preserve">0.036</w:t>
-            </w:r>
-          </w:p>
-        </w:tc>
-        <w:tc>
-          <w:tcPr>
-            <w:tcW w:type="dxa" w:w="2400"/>
-            <w:shd w:fill="eef4f3"/>
-          </w:tcPr>
-          <w:p>
-            <w:pPr>
-              <w:jc w:val="center"/>
-            </w:pPr>
-            <w:r>
-              <w:rPr>
-                <w:b w:val="false"/>
-                <w:bCs w:val="false"/>
-                <w:color w:val="1f2933"/>
-                <w:sz w:val="16"/>
-                <w:szCs w:val="16"/>
-              </w:rPr>
-              <w:t xml:space="preserve">0.807</w:t>
-            </w:r>
-          </w:p>
-        </w:tc>
-        <w:tc>
-          <w:tcPr>
-            <w:tcW w:type="dxa" w:w="1400"/>
+              <w:t xml:space="preserve">0.07</w:t>
+            </w:r>
+          </w:p>
+        </w:tc>
+        <w:tc>
+          <w:tcPr>
+            <w:tcW w:type="dxa" w:w="1000"/>
             <w:shd w:fill="eef4f3"/>
           </w:tcPr>
           <w:p>
@@ -3498,7 +3602,7 @@
       <w:tr>
         <w:tc>
           <w:tcPr>
-            <w:tcW w:type="dxa" w:w="3800"/>
+            <w:tcW w:type="dxa" w:w="2900"/>
           </w:tcPr>
           <w:p>
             <w:pPr>
@@ -3518,6 +3622,46 @@
         </w:tc>
         <w:tc>
           <w:tcPr>
+            <w:tcW w:type="dxa" w:w="1900"/>
+          </w:tcPr>
+          <w:p>
+            <w:pPr>
+              <w:jc w:val="center"/>
+            </w:pPr>
+            <w:r>
+              <w:rPr>
+                <w:b w:val="false"/>
+                <w:bCs w:val="false"/>
+                <w:color w:val="1f2933"/>
+                <w:sz w:val="16"/>
+                <w:szCs w:val="16"/>
+              </w:rPr>
+              <w:t xml:space="preserve">0.040 ± 0.004</w:t>
+            </w:r>
+          </w:p>
+        </w:tc>
+        <w:tc>
+          <w:tcPr>
+            <w:tcW w:type="dxa" w:w="1900"/>
+          </w:tcPr>
+          <w:p>
+            <w:pPr>
+              <w:jc w:val="center"/>
+            </w:pPr>
+            <w:r>
+              <w:rPr>
+                <w:b w:val="false"/>
+                <w:bCs w:val="false"/>
+                <w:color w:val="1f2933"/>
+                <w:sz w:val="16"/>
+                <w:szCs w:val="16"/>
+              </w:rPr>
+              <w:t xml:space="preserve">0.878 ± 0.016</w:t>
+            </w:r>
+          </w:p>
+        </w:tc>
+        <w:tc>
+          <w:tcPr>
             <w:tcW w:type="dxa" w:w="1700"/>
           </w:tcPr>
           <w:p>
@@ -3532,33 +3676,13 @@
                 <w:sz w:val="16"/>
                 <w:szCs w:val="16"/>
               </w:rPr>
-              <w:t xml:space="preserve">0.040</w:t>
-            </w:r>
-          </w:p>
-        </w:tc>
-        <w:tc>
-          <w:tcPr>
-            <w:tcW w:type="dxa" w:w="2400"/>
-          </w:tcPr>
-          <w:p>
-            <w:pPr>
-              <w:jc w:val="center"/>
-            </w:pPr>
-            <w:r>
-              <w:rPr>
-                <w:b w:val="false"/>
-                <w:bCs w:val="false"/>
-                <w:color w:val="1f2933"/>
-                <w:sz w:val="16"/>
-                <w:szCs w:val="16"/>
-              </w:rPr>
-              <w:t xml:space="preserve">0.878</w:t>
-            </w:r>
-          </w:p>
-        </w:tc>
-        <w:tc>
-          <w:tcPr>
-            <w:tcW w:type="dxa" w:w="1400"/>
+              <w:t xml:space="preserve">0.10</w:t>
+            </w:r>
+          </w:p>
+        </w:tc>
+        <w:tc>
+          <w:tcPr>
+            <w:tcW w:type="dxa" w:w="1000"/>
           </w:tcPr>
           <w:p>
             <w:pPr>
@@ -3580,7 +3704,7 @@
       <w:tr>
         <w:tc>
           <w:tcPr>
-            <w:tcW w:type="dxa" w:w="3800"/>
+            <w:tcW w:type="dxa" w:w="2900"/>
             <w:shd w:fill="eef4f3"/>
           </w:tcPr>
           <w:p>
@@ -3601,6 +3725,48 @@
         </w:tc>
         <w:tc>
           <w:tcPr>
+            <w:tcW w:type="dxa" w:w="1900"/>
+            <w:shd w:fill="eef4f3"/>
+          </w:tcPr>
+          <w:p>
+            <w:pPr>
+              <w:jc w:val="center"/>
+            </w:pPr>
+            <w:r>
+              <w:rPr>
+                <w:b w:val="false"/>
+                <w:bCs w:val="false"/>
+                <w:color w:val="1f2933"/>
+                <w:sz w:val="16"/>
+                <w:szCs w:val="16"/>
+              </w:rPr>
+              <w:t xml:space="preserve">0.026 ± 0.004</w:t>
+            </w:r>
+          </w:p>
+        </w:tc>
+        <w:tc>
+          <w:tcPr>
+            <w:tcW w:type="dxa" w:w="1900"/>
+            <w:shd w:fill="eef4f3"/>
+          </w:tcPr>
+          <w:p>
+            <w:pPr>
+              <w:jc w:val="center"/>
+            </w:pPr>
+            <w:r>
+              <w:rPr>
+                <w:b w:val="false"/>
+                <w:bCs w:val="false"/>
+                <w:color w:val="1f2933"/>
+                <w:sz w:val="16"/>
+                <w:szCs w:val="16"/>
+              </w:rPr>
+              <w:t xml:space="preserve">0.891 ± 0.017</w:t>
+            </w:r>
+          </w:p>
+        </w:tc>
+        <w:tc>
+          <w:tcPr>
             <w:tcW w:type="dxa" w:w="1700"/>
             <w:shd w:fill="eef4f3"/>
           </w:tcPr>
@@ -3616,34 +3782,13 @@
                 <w:sz w:val="16"/>
                 <w:szCs w:val="16"/>
               </w:rPr>
-              <w:t xml:space="preserve">0.026</w:t>
-            </w:r>
-          </w:p>
-        </w:tc>
-        <w:tc>
-          <w:tcPr>
-            <w:tcW w:type="dxa" w:w="2400"/>
-            <w:shd w:fill="eef4f3"/>
-          </w:tcPr>
-          <w:p>
-            <w:pPr>
-              <w:jc w:val="center"/>
-            </w:pPr>
-            <w:r>
-              <w:rPr>
-                <w:b w:val="false"/>
-                <w:bCs w:val="false"/>
-                <w:color w:val="1f2933"/>
-                <w:sz w:val="16"/>
-                <w:szCs w:val="16"/>
-              </w:rPr>
-              <w:t xml:space="preserve">0.891</w:t>
-            </w:r>
-          </w:p>
-        </w:tc>
-        <w:tc>
-          <w:tcPr>
-            <w:tcW w:type="dxa" w:w="1400"/>
+              <w:t xml:space="preserve">0.07</w:t>
+            </w:r>
+          </w:p>
+        </w:tc>
+        <w:tc>
+          <w:tcPr>
+            <w:tcW w:type="dxa" w:w="1000"/>
             <w:shd w:fill="eef4f3"/>
           </w:tcPr>
           <w:p>
@@ -3742,7 +3887,7 @@
         <w:spacing w:after="80" w:before="170"/>
       </w:pPr>
       <w:r>
-        <w:t xml:space="preserve">4.4 Image-level triage and what TONO cannot evaluate</w:t>
+        <w:t xml:space="preserve">4.4 Exploratory image-level triage on TONO</w:t>
       </w:r>
     </w:p>
     <w:p>
@@ -3751,7 +3896,7 @@
         <w:jc w:val="both"/>
       </w:pPr>
       <w:r>
-        <w:t xml:space="preserve">Aggregating the Mondrian per-criterion sets into an image decision yields 0 ACCEPT, 958 REJECT and 36 RETAKE on the 994-image test set, and none of the 925 true-violation images is wrongly accepted (Figure 5). We deliberately do not over-claim this safety property: TONO is single-violation, so essentially no genuinely compliant images exist, the ACCEPT class is empty, and image-level specificity (the risk of wrongly rejecting a compliant photo) cannot be tested here. This is a limitation of the dataset, not of the method, and it is the concrete reason a real multi-attribute dataset with a genuine ACCEPT class is needed.</w:t>
+        <w:t xml:space="preserve">Aggregating the Mondrian per-criterion sets into an image decision yields 0 ACCEPT, 958 REJECT and 36 RETAKE on the 994-image test set (Figure 5). Because a naive REJECT count conflates rejecting for the right reason with rejecting for the wrong one, we decompose the outcome on the 925 in-scope violation images by whether the truly-violated criterion is the one flagged. We find 822 correct-target REJECTs (88.9%, the real violation is confidently flagged), 67 wrong-reason REJECTs (7.2%, the image is rejected but on a different criterion, so the real violation is missed even though the photo is still stopped), 36 RETAKEs (3.9%), and 0 ACCEPTs. So the triage not only avoids accepting any true violation, it flags the correct criterion in the large majority of cases; the 7.2% wrong-reason rejections are the honest failure mode to report. We do not over-claim a general safety property: TONO is single-violation, so essentially no genuinely compliant images exist, the ACCEPT class is empty, and image-level specificity (the risk of wrongly rejecting a compliant photo) cannot be tested here. This is a limitation of the dataset, not of the method, and it is the concrete reason a real multi-attribute dataset with a genuine ACCEPT class is needed.</w:t>
       </w:r>
     </w:p>
     <w:p>

</xml_diff>